<commit_message>
docs: update LIBRARY_DEPLOYMENT_GUIDE.docx with latest security exit and override protocols
</commit_message>
<xml_diff>
--- a/docs/LIBRARY_DEPLOYMENT_GUIDE.docx
+++ b/docs/LIBRARY_DEPLOYMENT_GUIDE.docx
@@ -1221,6 +1221,566 @@
     <w:p>
       <w:pPr>
         <w:keepNext/>
+        <w:spacing w:before="240" w:after="80"/>
+      </w:pPr>
+      <w:r>
+        <w:rPr>
+          <w:rFonts w:ascii="Calibri" w:hAnsi="Calibri"/>
+          <w:b/>
+          <w:color w:val="334155"/>
+          <w:sz w:val="25"/>
+        </w:rPr>
+        <w:t>Workstation Topologies: 3 Supported Counter Configurations</w:t>
+      </w:r>
+    </w:p>
+    <w:p>
+      <w:pPr>
+        <w:spacing w:before="40" w:after="80" w:line="276" w:lineRule="auto"/>
+      </w:pPr>
+      <w:r>
+        <w:rPr>
+          <w:rFonts w:ascii="Calibri" w:hAnsi="Calibri"/>
+          <w:color w:val="334155"/>
+          <w:sz w:val="21"/>
+        </w:rPr>
+        <w:t>Because iVentor strictly decouples the /counter kiosk route from the authenticated /admin console and synchronizes live data via Supabase Cloud, all three physical setups below work out-of-the-box with zero code changes:</w:t>
+      </w:r>
+    </w:p>
+    <w:tbl>
+      <w:tblPr>
+        <w:tblW w:type="auto" w:w="0"/>
+        <w:jc w:val="center"/>
+        <w:tblLayout w:type="fixed"/>
+        <w:tblLook w:firstColumn="1" w:firstRow="1" w:lastColumn="0" w:lastRow="0" w:noHBand="0" w:noVBand="1" w:val="04A0"/>
+      </w:tblPr>
+      <w:tblGrid>
+        <w:gridCol w:w="3312"/>
+        <w:gridCol w:w="3312"/>
+        <w:gridCol w:w="3312"/>
+      </w:tblGrid>
+      <w:tr>
+        <w:tc>
+          <w:tcPr>
+            <w:tcW w:type="dxa" w:w="3024"/>
+            <w:shd w:fill="1E3A8A"/>
+            <w:tcMar>
+              <w:top w:w="100" w:type="dxa"/>
+              <w:bottom w:w="100" w:type="dxa"/>
+              <w:left w:w="120" w:type="dxa"/>
+              <w:right w:w="120" w:type="dxa"/>
+            </w:tcMar>
+          </w:tcPr>
+          <w:p>
+            <w:r>
+              <w:rPr>
+                <w:rFonts w:ascii="Calibri" w:hAnsi="Calibri"/>
+                <w:b/>
+                <w:color w:val="FFFFFF"/>
+                <w:sz w:val="19"/>
+              </w:rPr>
+              <w:t>Setup 1: Single PC (Role-Switched)</w:t>
+            </w:r>
+          </w:p>
+        </w:tc>
+        <w:tc>
+          <w:tcPr>
+            <w:tcW w:type="dxa" w:w="3168"/>
+            <w:shd w:fill="1E3A8A"/>
+            <w:tcMar>
+              <w:top w:w="100" w:type="dxa"/>
+              <w:bottom w:w="100" w:type="dxa"/>
+              <w:left w:w="120" w:type="dxa"/>
+              <w:right w:w="120" w:type="dxa"/>
+            </w:tcMar>
+          </w:tcPr>
+          <w:p>
+            <w:r>
+              <w:rPr>
+                <w:rFonts w:ascii="Calibri" w:hAnsi="Calibri"/>
+                <w:b/>
+                <w:color w:val="FFFFFF"/>
+                <w:sz w:val="19"/>
+              </w:rPr>
+              <w:t>Setup 2: Dual-Monitor on 1 PC</w:t>
+            </w:r>
+          </w:p>
+        </w:tc>
+        <w:tc>
+          <w:tcPr>
+            <w:tcW w:type="dxa" w:w="3168"/>
+            <w:shd w:fill="1E3A8A"/>
+            <w:tcMar>
+              <w:top w:w="100" w:type="dxa"/>
+              <w:bottom w:w="100" w:type="dxa"/>
+              <w:left w:w="120" w:type="dxa"/>
+              <w:right w:w="120" w:type="dxa"/>
+            </w:tcMar>
+          </w:tcPr>
+          <w:p>
+            <w:r>
+              <w:rPr>
+                <w:rFonts w:ascii="Calibri" w:hAnsi="Calibri"/>
+                <w:b/>
+                <w:color w:val="FFFFFF"/>
+                <w:sz w:val="19"/>
+              </w:rPr>
+              <w:t>Setup 3: Dedicated Kiosk + Mobile/Laptop</w:t>
+            </w:r>
+          </w:p>
+        </w:tc>
+      </w:tr>
+      <w:tr>
+        <w:tc>
+          <w:tcPr>
+            <w:tcW w:type="dxa" w:w="3024"/>
+            <w:shd w:fill="F1F5F9"/>
+            <w:tcMar>
+              <w:top w:w="90" w:type="dxa"/>
+              <w:bottom w:w="90" w:type="dxa"/>
+              <w:left w:w="110" w:type="dxa"/>
+              <w:right w:w="110" w:type="dxa"/>
+            </w:tcMar>
+          </w:tcPr>
+          <w:p>
+            <w:pPr>
+              <w:spacing w:line="276" w:lineRule="auto"/>
+            </w:pPr>
+            <w:r>
+              <w:rPr>
+                <w:rFonts w:ascii="Calibri" w:hAnsi="Calibri"/>
+                <w:color w:val="334155"/>
+                <w:sz w:val="18"/>
+              </w:rPr>
+              <w:t>• 1 PC Tower / Laptop</w:t>
+              <w:br/>
+              <w:t>• 1 Single Monitor</w:t>
+              <w:br/>
+              <w:t>• 1 Handheld Scanner</w:t>
+              <w:br/>
+              <w:t>• Zero extra hardware cost</w:t>
+              <w:br/>
+              <w:t>• Role-switched for staff tasks</w:t>
+            </w:r>
+          </w:p>
+        </w:tc>
+        <w:tc>
+          <w:tcPr>
+            <w:tcW w:type="dxa" w:w="3168"/>
+            <w:shd w:fill="F1F5F9"/>
+            <w:tcMar>
+              <w:top w:w="90" w:type="dxa"/>
+              <w:bottom w:w="90" w:type="dxa"/>
+              <w:left w:w="110" w:type="dxa"/>
+              <w:right w:w="110" w:type="dxa"/>
+            </w:tcMar>
+          </w:tcPr>
+          <w:p>
+            <w:pPr>
+              <w:spacing w:line="276" w:lineRule="auto"/>
+            </w:pPr>
+            <w:r>
+              <w:rPr>
+                <w:rFonts w:ascii="Calibri" w:hAnsi="Calibri"/>
+                <w:color w:val="334155"/>
+                <w:sz w:val="18"/>
+              </w:rPr>
+              <w:t>• 1 PC Tower (2 Video Ports)</w:t>
+              <w:br/>
+              <w:t>• 2 Monitors (Student + Staff)</w:t>
+              <w:br/>
+              <w:t>• 1 Handheld Scanner</w:t>
+              <w:br/>
+              <w:t>• Simultaneous student checkout &amp; staff management</w:t>
+            </w:r>
+          </w:p>
+        </w:tc>
+        <w:tc>
+          <w:tcPr>
+            <w:tcW w:type="dxa" w:w="3168"/>
+            <w:shd w:fill="F1F5F9"/>
+            <w:tcMar>
+              <w:top w:w="90" w:type="dxa"/>
+              <w:bottom w:w="90" w:type="dxa"/>
+              <w:left w:w="110" w:type="dxa"/>
+              <w:right w:w="110" w:type="dxa"/>
+            </w:tcMar>
+          </w:tcPr>
+          <w:p>
+            <w:pPr>
+              <w:spacing w:line="276" w:lineRule="auto"/>
+            </w:pPr>
+            <w:r>
+              <w:rPr>
+                <w:rFonts w:ascii="Calibri" w:hAnsi="Calibri"/>
+                <w:color w:val="334155"/>
+                <w:sz w:val="18"/>
+              </w:rPr>
+              <w:t>• 1 Counter PC (Student only)</w:t>
+              <w:br/>
+              <w:t>• 1 Staff Laptop or Smartphone</w:t>
+              <w:br/>
+              <w:t>• 1 Handheld Scanner</w:t>
+              <w:br/>
+              <w:t>• Absolute physical isolation</w:t>
+              <w:br/>
+              <w:t>• Remote terminal control via Wi-Fi</w:t>
+            </w:r>
+          </w:p>
+        </w:tc>
+      </w:tr>
+    </w:tbl>
+    <w:p>
+      <w:pPr>
+        <w:spacing w:before="160"/>
+      </w:pPr>
+    </w:p>
+    <w:p>
+      <w:pPr>
+        <w:keepNext/>
+        <w:spacing w:before="240" w:after="80"/>
+      </w:pPr>
+      <w:r>
+        <w:rPr>
+          <w:rFonts w:ascii="Calibri" w:hAnsi="Calibri"/>
+          <w:b/>
+          <w:color w:val="334155"/>
+          <w:sz w:val="25"/>
+        </w:rPr>
+        <w:t>Setup 1: Single PC (Role-Switched / Single Monitor)</w:t>
+      </w:r>
+    </w:p>
+    <w:p>
+      <w:pPr>
+        <w:pStyle w:val="ListBullet"/>
+        <w:spacing w:before="20" w:after="40" w:line="276" w:lineRule="auto"/>
+      </w:pPr>
+      <w:r>
+        <w:rPr>
+          <w:rFonts w:ascii="Calibri" w:hAnsi="Calibri"/>
+          <w:b/>
+          <w:color w:val="0F172A"/>
+          <w:sz w:val="21"/>
+        </w:rPr>
+        <w:t>Hardware Setup:</w:t>
+      </w:r>
+      <w:r>
+        <w:rPr>
+          <w:rFonts w:ascii="Calibri" w:hAnsi="Calibri"/>
+          <w:color w:val="334155"/>
+          <w:sz w:val="21"/>
+        </w:rPr>
+        <w:t xml:space="preserve"> Place the PC on the circulation desk. Plug in the handheld USB barcode scanner.</w:t>
+      </w:r>
+    </w:p>
+    <w:p>
+      <w:pPr>
+        <w:pStyle w:val="ListBullet"/>
+        <w:spacing w:before="20" w:after="40" w:line="276" w:lineRule="auto"/>
+      </w:pPr>
+      <w:r>
+        <w:rPr>
+          <w:rFonts w:ascii="Calibri" w:hAnsi="Calibri"/>
+          <w:b/>
+          <w:color w:val="0F172A"/>
+          <w:sz w:val="21"/>
+        </w:rPr>
+        <w:t>Kiosk Lockdown:</w:t>
+      </w:r>
+      <w:r>
+        <w:rPr>
+          <w:rFonts w:ascii="Calibri" w:hAnsi="Calibri"/>
+          <w:color w:val="334155"/>
+          <w:sz w:val="21"/>
+        </w:rPr>
+        <w:t xml:space="preserve"> Run scripts/setup-autostart-kiosk.bat to boot directly into /counter. Run scripts/toggle-taskmgr-lock.bat [1] to lock Task Manager.</w:t>
+      </w:r>
+    </w:p>
+    <w:p>
+      <w:pPr>
+        <w:pStyle w:val="ListBullet"/>
+        <w:spacing w:before="20" w:after="40" w:line="276" w:lineRule="auto"/>
+      </w:pPr>
+      <w:r>
+        <w:rPr>
+          <w:rFonts w:ascii="Calibri" w:hAnsi="Calibri"/>
+          <w:b/>
+          <w:color w:val="0F172A"/>
+          <w:sz w:val="21"/>
+        </w:rPr>
+        <w:t>Student Operation:</w:t>
+      </w:r>
+      <w:r>
+        <w:rPr>
+          <w:rFonts w:ascii="Calibri" w:hAnsi="Calibri"/>
+          <w:color w:val="334155"/>
+          <w:sz w:val="21"/>
+        </w:rPr>
+        <w:t xml:space="preserve"> The PC runs in fullscreen /counter. Students enter email, receive OTP, and scan books.</w:t>
+      </w:r>
+    </w:p>
+    <w:p>
+      <w:pPr>
+        <w:pStyle w:val="ListBullet"/>
+        <w:spacing w:before="20" w:after="40" w:line="276" w:lineRule="auto"/>
+      </w:pPr>
+      <w:r>
+        <w:rPr>
+          <w:rFonts w:ascii="Calibri" w:hAnsi="Calibri"/>
+          <w:b/>
+          <w:color w:val="0F172A"/>
+          <w:sz w:val="21"/>
+        </w:rPr>
+        <w:t>Staff Administration:</w:t>
+      </w:r>
+      <w:r>
+        <w:rPr>
+          <w:rFonts w:ascii="Calibri" w:hAnsi="Calibri"/>
+          <w:color w:val="334155"/>
+          <w:sz w:val="21"/>
+        </w:rPr>
+        <w:t xml:space="preserve"> Librarian clicks 'Admin Console' (or presses Alt+F4), logs in at /login, and completes inventory or export tasks. When done, clicks 'Launch Counter Terminal' to return to student mode.</w:t>
+      </w:r>
+    </w:p>
+    <w:p>
+      <w:pPr>
+        <w:pStyle w:val="ListBullet"/>
+        <w:spacing w:before="20" w:after="40" w:line="276" w:lineRule="auto"/>
+      </w:pPr>
+      <w:r>
+        <w:rPr>
+          <w:rFonts w:ascii="Calibri" w:hAnsi="Calibri"/>
+          <w:b/>
+          <w:color w:val="0F172A"/>
+          <w:sz w:val="21"/>
+        </w:rPr>
+        <w:t>Security Check:</w:t>
+      </w:r>
+      <w:r>
+        <w:rPr>
+          <w:rFonts w:ascii="Calibri" w:hAnsi="Calibri"/>
+          <w:color w:val="334155"/>
+          <w:sz w:val="21"/>
+        </w:rPr>
+        <w:t xml:space="preserve"> Even if a student attempts to navigate to /admin, Supabase authentication strictly blocks access with an admin password wall.</w:t>
+      </w:r>
+    </w:p>
+    <w:p>
+      <w:pPr>
+        <w:keepNext/>
+        <w:spacing w:before="240" w:after="80"/>
+      </w:pPr>
+      <w:r>
+        <w:rPr>
+          <w:rFonts w:ascii="Calibri" w:hAnsi="Calibri"/>
+          <w:b/>
+          <w:color w:val="334155"/>
+          <w:sz w:val="25"/>
+        </w:rPr>
+        <w:t>Setup 2: Dual-Monitor on Single PC (The Bank / Circulation Counter Model)</w:t>
+      </w:r>
+    </w:p>
+    <w:p>
+      <w:pPr>
+        <w:pStyle w:val="ListBullet"/>
+        <w:spacing w:before="20" w:after="40" w:line="276" w:lineRule="auto"/>
+      </w:pPr>
+      <w:r>
+        <w:rPr>
+          <w:rFonts w:ascii="Calibri" w:hAnsi="Calibri"/>
+          <w:b/>
+          <w:color w:val="0F172A"/>
+          <w:sz w:val="21"/>
+        </w:rPr>
+        <w:t>Hardware Setup:</w:t>
+      </w:r>
+      <w:r>
+        <w:rPr>
+          <w:rFonts w:ascii="Calibri" w:hAnsi="Calibri"/>
+          <w:color w:val="334155"/>
+          <w:sz w:val="21"/>
+        </w:rPr>
+        <w:t xml:space="preserve"> 1 PC Tower with two video outputs (HDMI + VGA/DisplayPort), 2 Monitors, 1 USB Scanner.</w:t>
+      </w:r>
+    </w:p>
+    <w:p>
+      <w:pPr>
+        <w:pStyle w:val="ListBullet"/>
+        <w:spacing w:before="20" w:after="40" w:line="276" w:lineRule="auto"/>
+      </w:pPr>
+      <w:r>
+        <w:rPr>
+          <w:rFonts w:ascii="Calibri" w:hAnsi="Calibri"/>
+          <w:b/>
+          <w:color w:val="0F172A"/>
+          <w:sz w:val="21"/>
+        </w:rPr>
+        <w:t>Windows Display Setup:</w:t>
+      </w:r>
+      <w:r>
+        <w:rPr>
+          <w:rFonts w:ascii="Calibri" w:hAnsi="Calibri"/>
+          <w:color w:val="334155"/>
+          <w:sz w:val="21"/>
+        </w:rPr>
+        <w:t xml:space="preserve"> In Windows Settings -&gt; System -&gt; Display, select 'Extend these displays' (do NOT duplicate). Monitor 1 faces staff, Monitor 2 faces students.</w:t>
+      </w:r>
+    </w:p>
+    <w:p>
+      <w:pPr>
+        <w:pStyle w:val="ListBullet"/>
+        <w:spacing w:before="20" w:after="40" w:line="276" w:lineRule="auto"/>
+      </w:pPr>
+      <w:r>
+        <w:rPr>
+          <w:rFonts w:ascii="Calibri" w:hAnsi="Calibri"/>
+          <w:b/>
+          <w:color w:val="0F172A"/>
+          <w:sz w:val="21"/>
+        </w:rPr>
+        <w:t>Window Routing:</w:t>
+      </w:r>
+      <w:r>
+        <w:rPr>
+          <w:rFonts w:ascii="Calibri" w:hAnsi="Calibri"/>
+          <w:color w:val="334155"/>
+          <w:sz w:val="21"/>
+        </w:rPr>
+        <w:t xml:space="preserve"> On Monitor 1 (Staff Screen), open normal browser to /admin and log in. On Monitor 2 (Student Screen), launch fullscreen kiosk mode targeting /counter.</w:t>
+      </w:r>
+    </w:p>
+    <w:p>
+      <w:pPr>
+        <w:pStyle w:val="ListBullet"/>
+        <w:spacing w:before="20" w:after="40" w:line="276" w:lineRule="auto"/>
+      </w:pPr>
+      <w:r>
+        <w:rPr>
+          <w:rFonts w:ascii="Calibri" w:hAnsi="Calibri"/>
+          <w:b/>
+          <w:color w:val="0F172A"/>
+          <w:sz w:val="21"/>
+        </w:rPr>
+        <w:t>Daily Workflow:</w:t>
+      </w:r>
+      <w:r>
+        <w:rPr>
+          <w:rFonts w:ascii="Calibri" w:hAnsi="Calibri"/>
+          <w:color w:val="334155"/>
+          <w:sz w:val="21"/>
+        </w:rPr>
+        <w:t xml:space="preserve"> Students scan and borrow books independently on Monitor 2, while the librarian catalogs books, audits overdue loans, and prints stickers on Monitor 1 simultaneously.</w:t>
+      </w:r>
+    </w:p>
+    <w:p>
+      <w:pPr>
+        <w:keepNext/>
+        <w:spacing w:before="240" w:after="80"/>
+      </w:pPr>
+      <w:r>
+        <w:rPr>
+          <w:rFonts w:ascii="Calibri" w:hAnsi="Calibri"/>
+          <w:b/>
+          <w:color w:val="334155"/>
+          <w:sz w:val="25"/>
+        </w:rPr>
+        <w:t>Setup 3: Dedicated Counter PC + Remote Admin on Librarian Laptop / Mobile</w:t>
+      </w:r>
+    </w:p>
+    <w:p>
+      <w:pPr>
+        <w:pStyle w:val="ListBullet"/>
+        <w:spacing w:before="20" w:after="40" w:line="276" w:lineRule="auto"/>
+      </w:pPr>
+      <w:r>
+        <w:rPr>
+          <w:rFonts w:ascii="Calibri" w:hAnsi="Calibri"/>
+          <w:b/>
+          <w:color w:val="0F172A"/>
+          <w:sz w:val="21"/>
+        </w:rPr>
+        <w:t>Hardware Setup:</w:t>
+      </w:r>
+      <w:r>
+        <w:rPr>
+          <w:rFonts w:ascii="Calibri" w:hAnsi="Calibri"/>
+          <w:color w:val="334155"/>
+          <w:sz w:val="21"/>
+        </w:rPr>
+        <w:t xml:space="preserve"> Counter PC is 100% dedicated to students on /counter. Librarian connects personal laptop, tablet, or smartphone to college Wi-Fi.</w:t>
+      </w:r>
+    </w:p>
+    <w:p>
+      <w:pPr>
+        <w:pStyle w:val="ListBullet"/>
+        <w:spacing w:before="20" w:after="40" w:line="276" w:lineRule="auto"/>
+      </w:pPr>
+      <w:r>
+        <w:rPr>
+          <w:rFonts w:ascii="Calibri" w:hAnsi="Calibri"/>
+          <w:b/>
+          <w:color w:val="0F172A"/>
+          <w:sz w:val="21"/>
+        </w:rPr>
+        <w:t>Counter Isolation:</w:t>
+      </w:r>
+      <w:r>
+        <w:rPr>
+          <w:rFonts w:ascii="Calibri" w:hAnsi="Calibri"/>
+          <w:color w:val="334155"/>
+          <w:sz w:val="21"/>
+        </w:rPr>
+        <w:t xml:space="preserve"> The Counter PC boots straight into /counter and runs 24/7. Students never see desktop icons, browser bars, or admin controls.</w:t>
+      </w:r>
+    </w:p>
+    <w:p>
+      <w:pPr>
+        <w:pStyle w:val="ListBullet"/>
+        <w:spacing w:before="20" w:after="40" w:line="276" w:lineRule="auto"/>
+      </w:pPr>
+      <w:r>
+        <w:rPr>
+          <w:rFonts w:ascii="Calibri" w:hAnsi="Calibri"/>
+          <w:b/>
+          <w:color w:val="0F172A"/>
+          <w:sz w:val="21"/>
+        </w:rPr>
+        <w:t>Remote Console:</w:t>
+      </w:r>
+      <w:r>
+        <w:rPr>
+          <w:rFonts w:ascii="Calibri" w:hAnsi="Calibri"/>
+          <w:color w:val="334155"/>
+          <w:sz w:val="21"/>
+        </w:rPr>
+        <w:t xml:space="preserve"> Librarian navigates to https://dept-library.vercel.app/admin on laptop/phone and logs in.</w:t>
+      </w:r>
+    </w:p>
+    <w:p>
+      <w:pPr>
+        <w:pStyle w:val="ListBullet"/>
+        <w:spacing w:before="20" w:after="40" w:line="276" w:lineRule="auto"/>
+      </w:pPr>
+      <w:r>
+        <w:rPr>
+          <w:rFonts w:ascii="Calibri" w:hAnsi="Calibri"/>
+          <w:b/>
+          <w:color w:val="0F172A"/>
+          <w:sz w:val="21"/>
+        </w:rPr>
+        <w:t>Remote Operation:</w:t>
+      </w:r>
+      <w:r>
+        <w:rPr>
+          <w:rFonts w:ascii="Calibri" w:hAnsi="Calibri"/>
+          <w:color w:val="334155"/>
+          <w:sz w:val="21"/>
+        </w:rPr>
+        <w:t xml:space="preserve"> Librarian can click 'Open Terminal Session' or 'Close Terminal Session' remotely from anywhere in the library. All borrow events stream live to staff dashboard.</w:t>
+      </w:r>
+    </w:p>
+    <w:p>
+      <w:pPr>
+        <w:keepNext/>
         <w:spacing w:before="360" w:after="120"/>
       </w:pPr>
       <w:r>
@@ -1304,7 +1864,7 @@
           <w:color w:val="0F172A"/>
           <w:sz w:val="21"/>
         </w:rPr>
-        <w:t>3. Staff Override Option:</w:t>
+        <w:t>3. PIN-Protected Staff Override:</w:t>
       </w:r>
       <w:r>
         <w:rPr>
@@ -1312,7 +1872,30 @@
           <w:color w:val="334155"/>
           <w:sz w:val="21"/>
         </w:rPr>
-        <w:t xml:space="preserve"> If a physical sticker is torn or scratched, the librarian can click 'Staff Override' at the top right of the scan box to authorize manual keyboard entry.</w:t>
+        <w:t xml:space="preserve"> If a physical sticker is torn or scratched, the librarian can click 'Staff Override'. A secure modal requires the 4-digit Staff PIN (default: 8821) before unlocking manual keyboard typing. Students cannot bypass the scanner because they do not know the PIN.</w:t>
+      </w:r>
+    </w:p>
+    <w:p>
+      <w:pPr>
+        <w:pStyle w:val="ListBullet"/>
+        <w:spacing w:before="20" w:after="40" w:line="276" w:lineRule="auto"/>
+      </w:pPr>
+      <w:r>
+        <w:rPr>
+          <w:rFonts w:ascii="Calibri" w:hAnsi="Calibri"/>
+          <w:b/>
+          <w:color w:val="0F172A"/>
+          <w:sz w:val="21"/>
+        </w:rPr>
+        <w:t>4. Anti-Tamper Exit Gate:</w:t>
+      </w:r>
+      <w:r>
+        <w:rPr>
+          <w:rFonts w:ascii="Calibri" w:hAnsi="Calibri"/>
+          <w:color w:val="334155"/>
+          <w:sz w:val="21"/>
+        </w:rPr>
+        <w:t xml:space="preserve"> If Alt+F4 is pressed, the kiosk launcher script catches the event and requires the 4-digit Staff PIN (8821) to exit to the Windows Desktop. Without the PIN, it automatically relaunches fullscreen within 1 second.</w:t>
       </w:r>
     </w:p>
     <w:p>

</xml_diff>